<commit_message>
Templates: use original template content with company names, PII and logos removed
Restores the original process and procedure text of the ready-made templates, redacting only
client names, people, contact details, logos and platform references. Adds the two nil-activity
email chains as their own templates and shows real file content on preview pages.

Co-Authored-By: Claude Opus 5.5 <noreply@anthropic.com>
Claude-Session: https://claude.ai/code/session_01DQ8ZSi2UY9xjrq8oz1Heak
</commit_message>
<xml_diff>
--- a/public/templates/control-environment-questionnaire.docx
+++ b/public/templates/control-environment-questionnaire.docx
@@ -3,21 +3,11 @@
 <w:document xmlns:wpc="http://schemas.microsoft.com/office/word/2010/wordprocessingCanvas" xmlns:mo="http://schemas.microsoft.com/office/mac/office/2008/main" xmlns:mc="http://schemas.openxmlformats.org/markup-compatibility/2006" xmlns:mv="urn:schemas-microsoft-com:mac:vml" xmlns:o="urn:schemas-microsoft-com:office:office" xmlns:r="http://schemas.openxmlformats.org/officeDocument/2006/relationships" xmlns:m="http://schemas.openxmlformats.org/officeDocument/2006/math" xmlns:v="urn:schemas-microsoft-com:vml" xmlns:wp14="http://schemas.microsoft.com/office/word/2010/wordprocessingDrawing" xmlns:wp="http://schemas.openxmlformats.org/drawingml/2006/wordprocessingDrawing" xmlns:w10="urn:schemas-microsoft-com:office:word" xmlns:w="http://schemas.openxmlformats.org/wordprocessingml/2006/main" xmlns:w14="http://schemas.microsoft.com/office/word/2010/wordml" xmlns:wpg="http://schemas.microsoft.com/office/word/2010/wordprocessingGroup" xmlns:wpi="http://schemas.microsoft.com/office/word/2010/wordprocessingInk" xmlns:wne="http://schemas.microsoft.com/office/word/2006/wordml" xmlns:wps="http://schemas.microsoft.com/office/word/2010/wordprocessingShape" mc:Ignorable="w14 wp14">
   <w:body>
     <w:p>
+      <w:pPr>
+        <w:pStyle w:val="Heading1"/>
+      </w:pPr>
       <w:r>
-        <w:rPr>
-          <w:b/>
-          <w:color w:val="5B21B6"/>
-          <w:sz w:val="40"/>
-        </w:rPr>
-        <w:t>Management Ethics and Control Environment Questionnaire</w:t>
-      </w:r>
-    </w:p>
-    <w:p>
-      <w:r>
-        <w:rPr>
-          <w:i/>
-        </w:rPr>
-        <w:t>[Organisation Name]</w:t>
+        <w:t>Ethical Management Survey</w:t>
       </w:r>
     </w:p>
     <w:tbl>
@@ -27,31 +17,33 @@
         <w:tblLook w:firstColumn="1" w:firstRow="1" w:lastColumn="0" w:lastRow="0" w:noHBand="0" w:noVBand="1" w:val="04A0"/>
       </w:tblPr>
       <w:tblGrid>
-        <w:gridCol w:w="4873"/>
-        <w:gridCol w:w="4873"/>
+        <w:gridCol w:w="4320"/>
+        <w:gridCol w:w="4320"/>
       </w:tblGrid>
       <w:tr>
         <w:tc>
           <w:tcPr>
-            <w:tcW w:type="dxa" w:w="2835"/>
-            <w:shd w:val="clear" w:color="auto" w:fill="EDE9FE"/>
+            <w:tcW w:type="dxa" w:w="4320"/>
           </w:tcPr>
           <w:p>
             <w:r>
               <w:rPr>
                 <w:b/>
               </w:rPr>
-              <w:t>Version</w:t>
+              <w:t>Questions</w:t>
             </w:r>
           </w:p>
         </w:tc>
         <w:tc>
           <w:tcPr>
-            <w:tcW w:type="dxa" w:w="6236"/>
+            <w:tcW w:type="dxa" w:w="4320"/>
           </w:tcPr>
           <w:p>
             <w:r>
-              <w:t>[x.x]</w:t>
+              <w:rPr>
+                <w:b/>
+              </w:rPr>
+              <w:t>Response</w:t>
             </w:r>
           </w:p>
         </w:tc>
@@ -59,25 +51,21 @@
       <w:tr>
         <w:tc>
           <w:tcPr>
-            <w:tcW w:type="dxa" w:w="2835"/>
-            <w:shd w:val="clear" w:color="auto" w:fill="EDE9FE"/>
+            <w:tcW w:type="dxa" w:w="4320"/>
           </w:tcPr>
           <w:p>
             <w:r>
-              <w:rPr>
-                <w:b/>
-              </w:rPr>
-              <w:t>Owner</w:t>
+              <w:t>What are some examples of management demonstrating and promoting ethical values within the company?</w:t>
             </w:r>
           </w:p>
         </w:tc>
         <w:tc>
           <w:tcPr>
-            <w:tcW w:type="dxa" w:w="6236"/>
+            <w:tcW w:type="dxa" w:w="4320"/>
           </w:tcPr>
           <w:p>
             <w:r>
-              <w:t>[Role, e.g. CEO / COO]</w:t>
+              <w:t>Management primarily serves as role models for staff in actions and deeds. Staff are reminded that the organization has a zero tolerance position when it comes to its standards. The organization is also active in the community as a member of the Chamber of Commerce and is an active participant in various activities geared towards addressing community needs and encouraging business participation by others.</w:t>
             </w:r>
           </w:p>
         </w:tc>
@@ -85,25 +73,21 @@
       <w:tr>
         <w:tc>
           <w:tcPr>
-            <w:tcW w:type="dxa" w:w="2835"/>
-            <w:shd w:val="clear" w:color="auto" w:fill="EDE9FE"/>
+            <w:tcW w:type="dxa" w:w="4320"/>
           </w:tcPr>
           <w:p>
             <w:r>
-              <w:rPr>
-                <w:b/>
-              </w:rPr>
-              <w:t>Approver</w:t>
+              <w:t>Describe your hiring process.</w:t>
             </w:r>
           </w:p>
         </w:tc>
         <w:tc>
           <w:tcPr>
-            <w:tcW w:type="dxa" w:w="6236"/>
+            <w:tcW w:type="dxa" w:w="4320"/>
           </w:tcPr>
           <w:p>
             <w:r>
-              <w:t>[Role]</w:t>
+              <w:t>Potential applicants meet with a member of upper management. Documents shared by the applicant are reviewed prior to the meeting. Upon hiring an offer letter is sent via electronic messaging and/or USPS. The letter is deemed accepted when signed by the applicant and returned. Once received a background check is completed using an approved third-party agency.</w:t>
             </w:r>
           </w:p>
         </w:tc>
@@ -111,25 +95,21 @@
       <w:tr>
         <w:tc>
           <w:tcPr>
-            <w:tcW w:type="dxa" w:w="2835"/>
-            <w:shd w:val="clear" w:color="auto" w:fill="EDE9FE"/>
+            <w:tcW w:type="dxa" w:w="4320"/>
           </w:tcPr>
           <w:p>
             <w:r>
-              <w:rPr>
-                <w:b/>
-              </w:rPr>
-              <w:t>Effective date</w:t>
+              <w:t>Is there a board of directors or investors charged with oversight? If so, list the names and backgrounds of that board's members.</w:t>
             </w:r>
           </w:p>
         </w:tc>
         <w:tc>
           <w:tcPr>
-            <w:tcW w:type="dxa" w:w="6236"/>
+            <w:tcW w:type="dxa" w:w="4320"/>
           </w:tcPr>
           <w:p>
             <w:r>
-              <w:t>[YYYY-MM-DD]</w:t>
+              <w:t>N/A. There is no board of directors</w:t>
             </w:r>
           </w:p>
         </w:tc>
@@ -137,25 +117,21 @@
       <w:tr>
         <w:tc>
           <w:tcPr>
-            <w:tcW w:type="dxa" w:w="2835"/>
-            <w:shd w:val="clear" w:color="auto" w:fill="EDE9FE"/>
+            <w:tcW w:type="dxa" w:w="4320"/>
           </w:tcPr>
           <w:p>
             <w:r>
-              <w:rPr>
-                <w:b/>
-              </w:rPr>
-              <w:t>Next review date</w:t>
+              <w:t>Do you expect to make major changes to your product or hosting environment, like creating new business units or changing cloud providers? If so, please describe them.</w:t>
             </w:r>
           </w:p>
         </w:tc>
         <w:tc>
           <w:tcPr>
-            <w:tcW w:type="dxa" w:w="6236"/>
+            <w:tcW w:type="dxa" w:w="4320"/>
           </w:tcPr>
           <w:p>
             <w:r>
-              <w:t>[YYYY-MM-DD]</w:t>
+              <w:t>Not at this time</w:t>
             </w:r>
           </w:p>
         </w:tc>
@@ -163,25 +139,21 @@
       <w:tr>
         <w:tc>
           <w:tcPr>
-            <w:tcW w:type="dxa" w:w="2835"/>
-            <w:shd w:val="clear" w:color="auto" w:fill="EDE9FE"/>
+            <w:tcW w:type="dxa" w:w="4320"/>
           </w:tcPr>
           <w:p>
             <w:r>
-              <w:rPr>
-                <w:b/>
-              </w:rPr>
-              <w:t>Classification</w:t>
+              <w:t>Describe any recurring executive meetings and how decisions from those meetings are communicated to employees.</w:t>
             </w:r>
           </w:p>
         </w:tc>
         <w:tc>
           <w:tcPr>
-            <w:tcW w:type="dxa" w:w="6236"/>
+            <w:tcW w:type="dxa" w:w="4320"/>
           </w:tcPr>
           <w:p>
             <w:r>
-              <w:t>Internal</w:t>
+              <w:t>The executive team meets on a bi-weekly basis to discuss the state of the organization and plan strategy. Meetings with employees on all matters related to the organization are held on a scheduled basis that varies with the department.</w:t>
             </w:r>
           </w:p>
         </w:tc>
@@ -189,139 +161,21 @@
       <w:tr>
         <w:tc>
           <w:tcPr>
-            <w:tcW w:type="dxa" w:w="2835"/>
-            <w:shd w:val="clear" w:color="auto" w:fill="EDE9FE"/>
+            <w:tcW w:type="dxa" w:w="4320"/>
           </w:tcPr>
           <w:p>
             <w:r>
-              <w:rPr>
-                <w:b/>
-              </w:rPr>
-              <w:t>Framework mapping</w:t>
+              <w:t>Describe any onboarding training that the new employees receive.</w:t>
             </w:r>
           </w:p>
         </w:tc>
         <w:tc>
           <w:tcPr>
-            <w:tcW w:type="dxa" w:w="6236"/>
+            <w:tcW w:type="dxa" w:w="4320"/>
           </w:tcPr>
           <w:p>
             <w:r>
-              <w:t>SOC 2 CC1.1 to CC1.5, CC2.2, CC2.3, CC3.4 | ISO/IEC 27001:2022 5.1, A.5.4, A.6.1</w:t>
-            </w:r>
-          </w:p>
-        </w:tc>
-      </w:tr>
-    </w:tbl>
-    <w:p/>
-    <w:p>
-      <w:pPr>
-        <w:pStyle w:val="Heading1"/>
-      </w:pPr>
-      <w:r>
-        <w:t>Purpose</w:t>
-      </w:r>
-    </w:p>
-    <w:p>
-      <w:r>
-        <w:rPr>
-          <w:b w:val="0"/>
-          <w:i w:val="0"/>
-        </w:rPr>
-        <w:t>Captures management's description of the control environment: ethical values, hiring, oversight, communication, training, complaint handling and significant changes. Auditors commonly request it at the start of a SOC 2 engagement. Answer each question factually and attach supporting evidence where noted.</w:t>
-      </w:r>
-    </w:p>
-    <w:tbl>
-      <w:tblPr>
-        <w:tblStyle w:val="TableGrid"/>
-        <w:tblW w:type="auto" w:w="0"/>
-        <w:tblLook w:firstColumn="1" w:firstRow="1" w:lastColumn="0" w:lastRow="0" w:noHBand="0" w:noVBand="1" w:val="04A0"/>
-      </w:tblPr>
-      <w:tblGrid>
-        <w:gridCol w:w="1949"/>
-        <w:gridCol w:w="1949"/>
-        <w:gridCol w:w="1949"/>
-        <w:gridCol w:w="1949"/>
-        <w:gridCol w:w="1949"/>
-      </w:tblGrid>
-      <w:tr>
-        <w:tc>
-          <w:tcPr>
-            <w:tcW w:type="dxa" w:w="1949"/>
-            <w:shd w:val="clear" w:color="auto" w:fill="5B21B6"/>
-          </w:tcPr>
-          <w:p>
-            <w:r>
-              <w:rPr>
-                <w:b/>
-                <w:color w:val="FFFFFF"/>
-                <w:sz w:val="19"/>
-              </w:rPr>
-              <w:t>#</w:t>
-            </w:r>
-          </w:p>
-        </w:tc>
-        <w:tc>
-          <w:tcPr>
-            <w:tcW w:type="dxa" w:w="1949"/>
-            <w:shd w:val="clear" w:color="auto" w:fill="5B21B6"/>
-          </w:tcPr>
-          <w:p>
-            <w:r>
-              <w:rPr>
-                <w:b/>
-                <w:color w:val="FFFFFF"/>
-                <w:sz w:val="19"/>
-              </w:rPr>
-              <w:t>Area</w:t>
-            </w:r>
-          </w:p>
-        </w:tc>
-        <w:tc>
-          <w:tcPr>
-            <w:tcW w:type="dxa" w:w="1949"/>
-            <w:shd w:val="clear" w:color="auto" w:fill="5B21B6"/>
-          </w:tcPr>
-          <w:p>
-            <w:r>
-              <w:rPr>
-                <w:b/>
-                <w:color w:val="FFFFFF"/>
-                <w:sz w:val="19"/>
-              </w:rPr>
-              <w:t>Question</w:t>
-            </w:r>
-          </w:p>
-        </w:tc>
-        <w:tc>
-          <w:tcPr>
-            <w:tcW w:type="dxa" w:w="1949"/>
-            <w:shd w:val="clear" w:color="auto" w:fill="5B21B6"/>
-          </w:tcPr>
-          <w:p>
-            <w:r>
-              <w:rPr>
-                <w:b/>
-                <w:color w:val="FFFFFF"/>
-                <w:sz w:val="19"/>
-              </w:rPr>
-              <w:t>Response</w:t>
-            </w:r>
-          </w:p>
-        </w:tc>
-        <w:tc>
-          <w:tcPr>
-            <w:tcW w:type="dxa" w:w="1949"/>
-            <w:shd w:val="clear" w:color="auto" w:fill="5B21B6"/>
-          </w:tcPr>
-          <w:p>
-            <w:r>
-              <w:rPr>
-                <w:b/>
-                <w:color w:val="FFFFFF"/>
-                <w:sz w:val="19"/>
-              </w:rPr>
-              <w:t>Supporting evidence</w:t>
+              <w:t>New hires are provided an onboarding packet including but not limited to an Employee Standards Manual, job description, and organizational chart. The employee is overseen by a supervisor during the initial period offering guidance and feedback as needed.</w:t>
             </w:r>
           </w:p>
         </w:tc>
@@ -329,49 +183,21 @@
       <w:tr>
         <w:tc>
           <w:tcPr>
-            <w:tcW w:type="dxa" w:w="1949"/>
+            <w:tcW w:type="dxa" w:w="4320"/>
           </w:tcPr>
           <w:p>
             <w:r>
-              <w:t>1</w:t>
+              <w:t>How does management monitor and respond to complaints from customers, vendors, or employees?</w:t>
             </w:r>
           </w:p>
         </w:tc>
         <w:tc>
           <w:tcPr>
-            <w:tcW w:type="dxa" w:w="1949"/>
+            <w:tcW w:type="dxa" w:w="4320"/>
           </w:tcPr>
           <w:p>
             <w:r>
-              <w:t>Ethics and integrity</w:t>
-            </w:r>
-          </w:p>
-        </w:tc>
-        <w:tc>
-          <w:tcPr>
-            <w:tcW w:type="dxa" w:w="1949"/>
-          </w:tcPr>
-          <w:p>
-            <w:r>
-              <w:t>What are examples of management demonstrating and promoting ethical values within the organisation?</w:t>
-            </w:r>
-          </w:p>
-        </w:tc>
-        <w:tc>
-          <w:tcPr>
-            <w:tcW w:type="dxa" w:w="1949"/>
-          </w:tcPr>
-          <w:p>
-            <w:r/>
-          </w:p>
-        </w:tc>
-        <w:tc>
-          <w:tcPr>
-            <w:tcW w:type="dxa" w:w="1949"/>
-          </w:tcPr>
-          <w:p>
-            <w:r>
-              <w:t>Code of conduct, all-hands slides, whistleblower channel</w:t>
+              <w:t>The organization uses JIRA for communication between the customers and vendors with responsibilities assigned to an appropriate member of the staff to address and communicate results. Employee issues are addressed one-on-one with a supervisor or member of the executive team</w:t>
             </w:r>
           </w:p>
         </w:tc>
@@ -379,49 +205,21 @@
       <w:tr>
         <w:tc>
           <w:tcPr>
-            <w:tcW w:type="dxa" w:w="1949"/>
+            <w:tcW w:type="dxa" w:w="4320"/>
           </w:tcPr>
           <w:p>
             <w:r>
-              <w:t>2</w:t>
+              <w:t>How do you solicit feedback from customers regarding the quality of your services?</w:t>
             </w:r>
           </w:p>
         </w:tc>
         <w:tc>
           <w:tcPr>
-            <w:tcW w:type="dxa" w:w="1949"/>
+            <w:tcW w:type="dxa" w:w="4320"/>
           </w:tcPr>
           <w:p>
             <w:r>
-              <w:t>Ethics and integrity</w:t>
-            </w:r>
-          </w:p>
-        </w:tc>
-        <w:tc>
-          <w:tcPr>
-            <w:tcW w:type="dxa" w:w="1949"/>
-          </w:tcPr>
-          <w:p>
-            <w:r>
-              <w:t>How are violations of the code of conduct identified, investigated and addressed?</w:t>
-            </w:r>
-          </w:p>
-        </w:tc>
-        <w:tc>
-          <w:tcPr>
-            <w:tcW w:type="dxa" w:w="1949"/>
-          </w:tcPr>
-          <w:p>
-            <w:r/>
-          </w:p>
-        </w:tc>
-        <w:tc>
-          <w:tcPr>
-            <w:tcW w:type="dxa" w:w="1949"/>
-          </w:tcPr>
-          <w:p>
-            <w:r>
-              <w:t>Disciplinary policy, case log (anonymised)</w:t>
+              <w:t>Meetings are held with select clients on a pre-arranged basis as needed.</w:t>
             </w:r>
           </w:p>
         </w:tc>
@@ -429,771 +227,34 @@
       <w:tr>
         <w:tc>
           <w:tcPr>
-            <w:tcW w:type="dxa" w:w="1949"/>
+            <w:tcW w:type="dxa" w:w="4320"/>
           </w:tcPr>
           <w:p>
             <w:r>
-              <w:t>3</w:t>
+              <w:t>Have there been any major problems (outages, lawsuits, etc.) during the audit period? If so, please describe them.</w:t>
             </w:r>
           </w:p>
         </w:tc>
         <w:tc>
           <w:tcPr>
-            <w:tcW w:type="dxa" w:w="1949"/>
+            <w:tcW w:type="dxa" w:w="4320"/>
           </w:tcPr>
           <w:p>
             <w:r>
-              <w:t>Hiring</w:t>
-            </w:r>
-          </w:p>
-        </w:tc>
-        <w:tc>
-          <w:tcPr>
-            <w:tcW w:type="dxa" w:w="1949"/>
-          </w:tcPr>
-          <w:p>
-            <w:r>
-              <w:t>Describe the hiring process from application to start date, including background checks and offer acceptance.</w:t>
-            </w:r>
-          </w:p>
-        </w:tc>
-        <w:tc>
-          <w:tcPr>
-            <w:tcW w:type="dxa" w:w="1949"/>
-          </w:tcPr>
-          <w:p>
-            <w:r/>
-          </w:p>
-        </w:tc>
-        <w:tc>
-          <w:tcPr>
-            <w:tcW w:type="dxa" w:w="1949"/>
-          </w:tcPr>
-          <w:p>
-            <w:r>
-              <w:t>Hiring procedure, background check log</w:t>
-            </w:r>
-          </w:p>
-        </w:tc>
-      </w:tr>
-      <w:tr>
-        <w:tc>
-          <w:tcPr>
-            <w:tcW w:type="dxa" w:w="1949"/>
-          </w:tcPr>
-          <w:p>
-            <w:r>
-              <w:t>4</w:t>
-            </w:r>
-          </w:p>
-        </w:tc>
-        <w:tc>
-          <w:tcPr>
-            <w:tcW w:type="dxa" w:w="1949"/>
-          </w:tcPr>
-          <w:p>
-            <w:r>
-              <w:t>Oversight</w:t>
-            </w:r>
-          </w:p>
-        </w:tc>
-        <w:tc>
-          <w:tcPr>
-            <w:tcW w:type="dxa" w:w="1949"/>
-          </w:tcPr>
-          <w:p>
-            <w:r>
-              <w:t>Is there a board of directors, advisory board or investors charged with oversight? If so, list members' roles and relevant backgrounds and how often they meet.</w:t>
-            </w:r>
-          </w:p>
-        </w:tc>
-        <w:tc>
-          <w:tcPr>
-            <w:tcW w:type="dxa" w:w="1949"/>
-          </w:tcPr>
-          <w:p>
-            <w:r/>
-          </w:p>
-        </w:tc>
-        <w:tc>
-          <w:tcPr>
-            <w:tcW w:type="dxa" w:w="1949"/>
-          </w:tcPr>
-          <w:p>
-            <w:r>
-              <w:t>Board charter, meeting minutes</w:t>
-            </w:r>
-          </w:p>
-        </w:tc>
-      </w:tr>
-      <w:tr>
-        <w:tc>
-          <w:tcPr>
-            <w:tcW w:type="dxa" w:w="1949"/>
-          </w:tcPr>
-          <w:p>
-            <w:r>
-              <w:t>5</w:t>
-            </w:r>
-          </w:p>
-        </w:tc>
-        <w:tc>
-          <w:tcPr>
-            <w:tcW w:type="dxa" w:w="1949"/>
-          </w:tcPr>
-          <w:p>
-            <w:r>
-              <w:t>Oversight</w:t>
-            </w:r>
-          </w:p>
-        </w:tc>
-        <w:tc>
-          <w:tcPr>
-            <w:tcW w:type="dxa" w:w="1949"/>
-          </w:tcPr>
-          <w:p>
-            <w:r>
-              <w:t>Who is accountable for information security, and how do they report to leadership?</w:t>
-            </w:r>
-          </w:p>
-        </w:tc>
-        <w:tc>
-          <w:tcPr>
-            <w:tcW w:type="dxa" w:w="1949"/>
-          </w:tcPr>
-          <w:p>
-            <w:r/>
-          </w:p>
-        </w:tc>
-        <w:tc>
-          <w:tcPr>
-            <w:tcW w:type="dxa" w:w="1949"/>
-          </w:tcPr>
-          <w:p>
-            <w:r>
-              <w:t>Org chart, roles and responsibilities</w:t>
-            </w:r>
-          </w:p>
-        </w:tc>
-      </w:tr>
-      <w:tr>
-        <w:tc>
-          <w:tcPr>
-            <w:tcW w:type="dxa" w:w="1949"/>
-          </w:tcPr>
-          <w:p>
-            <w:r>
-              <w:t>6</w:t>
-            </w:r>
-          </w:p>
-        </w:tc>
-        <w:tc>
-          <w:tcPr>
-            <w:tcW w:type="dxa" w:w="1949"/>
-          </w:tcPr>
-          <w:p>
-            <w:r>
-              <w:t>Change</w:t>
-            </w:r>
-          </w:p>
-        </w:tc>
-        <w:tc>
-          <w:tcPr>
-            <w:tcW w:type="dxa" w:w="1949"/>
-          </w:tcPr>
-          <w:p>
-            <w:r>
-              <w:t>Do you expect major changes to the product, hosting environment or organisation (new business units, cloud provider changes, acquisitions)? Describe them.</w:t>
-            </w:r>
-          </w:p>
-        </w:tc>
-        <w:tc>
-          <w:tcPr>
-            <w:tcW w:type="dxa" w:w="1949"/>
-          </w:tcPr>
-          <w:p>
-            <w:r/>
-          </w:p>
-        </w:tc>
-        <w:tc>
-          <w:tcPr>
-            <w:tcW w:type="dxa" w:w="1949"/>
-          </w:tcPr>
-          <w:p>
-            <w:r/>
-          </w:p>
-        </w:tc>
-      </w:tr>
-      <w:tr>
-        <w:tc>
-          <w:tcPr>
-            <w:tcW w:type="dxa" w:w="1949"/>
-          </w:tcPr>
-          <w:p>
-            <w:r>
-              <w:t>7</w:t>
-            </w:r>
-          </w:p>
-        </w:tc>
-        <w:tc>
-          <w:tcPr>
-            <w:tcW w:type="dxa" w:w="1949"/>
-          </w:tcPr>
-          <w:p>
-            <w:r>
-              <w:t>Communication</w:t>
-            </w:r>
-          </w:p>
-        </w:tc>
-        <w:tc>
-          <w:tcPr>
-            <w:tcW w:type="dxa" w:w="1949"/>
-          </w:tcPr>
-          <w:p>
-            <w:r>
-              <w:t>Describe recurring executive meetings and how decisions are communicated to employees.</w:t>
-            </w:r>
-          </w:p>
-        </w:tc>
-        <w:tc>
-          <w:tcPr>
-            <w:tcW w:type="dxa" w:w="1949"/>
-          </w:tcPr>
-          <w:p>
-            <w:r/>
-          </w:p>
-        </w:tc>
-        <w:tc>
-          <w:tcPr>
-            <w:tcW w:type="dxa" w:w="1949"/>
-          </w:tcPr>
-          <w:p>
-            <w:r>
-              <w:t>Meeting cadence, sample communication</w:t>
-            </w:r>
-          </w:p>
-        </w:tc>
-      </w:tr>
-      <w:tr>
-        <w:tc>
-          <w:tcPr>
-            <w:tcW w:type="dxa" w:w="1949"/>
-          </w:tcPr>
-          <w:p>
-            <w:r>
-              <w:t>8</w:t>
-            </w:r>
-          </w:p>
-        </w:tc>
-        <w:tc>
-          <w:tcPr>
-            <w:tcW w:type="dxa" w:w="1949"/>
-          </w:tcPr>
-          <w:p>
-            <w:r>
-              <w:t>Training</w:t>
-            </w:r>
-          </w:p>
-        </w:tc>
-        <w:tc>
-          <w:tcPr>
-            <w:tcW w:type="dxa" w:w="1949"/>
-          </w:tcPr>
-          <w:p>
-            <w:r>
-              <w:t>Describe the onboarding and recurring training employees receive, including security awareness.</w:t>
-            </w:r>
-          </w:p>
-        </w:tc>
-        <w:tc>
-          <w:tcPr>
-            <w:tcW w:type="dxa" w:w="1949"/>
-          </w:tcPr>
-          <w:p>
-            <w:r/>
-          </w:p>
-        </w:tc>
-        <w:tc>
-          <w:tcPr>
-            <w:tcW w:type="dxa" w:w="1949"/>
-          </w:tcPr>
-          <w:p>
-            <w:r>
-              <w:t>Training records</w:t>
-            </w:r>
-          </w:p>
-        </w:tc>
-      </w:tr>
-      <w:tr>
-        <w:tc>
-          <w:tcPr>
-            <w:tcW w:type="dxa" w:w="1949"/>
-          </w:tcPr>
-          <w:p>
-            <w:r>
-              <w:t>9</w:t>
-            </w:r>
-          </w:p>
-        </w:tc>
-        <w:tc>
-          <w:tcPr>
-            <w:tcW w:type="dxa" w:w="1949"/>
-          </w:tcPr>
-          <w:p>
-            <w:r>
-              <w:t>Performance</w:t>
-            </w:r>
-          </w:p>
-        </w:tc>
-        <w:tc>
-          <w:tcPr>
-            <w:tcW w:type="dxa" w:w="1949"/>
-          </w:tcPr>
-          <w:p>
-            <w:r>
-              <w:t>How are employee performance and adherence to policies evaluated?</w:t>
-            </w:r>
-          </w:p>
-        </w:tc>
-        <w:tc>
-          <w:tcPr>
-            <w:tcW w:type="dxa" w:w="1949"/>
-          </w:tcPr>
-          <w:p>
-            <w:r/>
-          </w:p>
-        </w:tc>
-        <w:tc>
-          <w:tcPr>
-            <w:tcW w:type="dxa" w:w="1949"/>
-          </w:tcPr>
-          <w:p>
-            <w:r>
-              <w:t>Review cycle evidence</w:t>
-            </w:r>
-          </w:p>
-        </w:tc>
-      </w:tr>
-      <w:tr>
-        <w:tc>
-          <w:tcPr>
-            <w:tcW w:type="dxa" w:w="1949"/>
-          </w:tcPr>
-          <w:p>
-            <w:r>
-              <w:t>10</w:t>
-            </w:r>
-          </w:p>
-        </w:tc>
-        <w:tc>
-          <w:tcPr>
-            <w:tcW w:type="dxa" w:w="1949"/>
-          </w:tcPr>
-          <w:p>
-            <w:r>
-              <w:t>Complaints</w:t>
-            </w:r>
-          </w:p>
-        </w:tc>
-        <w:tc>
-          <w:tcPr>
-            <w:tcW w:type="dxa" w:w="1949"/>
-          </w:tcPr>
-          <w:p>
-            <w:r>
-              <w:t>How does management monitor and respond to complaints from customers, vendors or employees?</w:t>
-            </w:r>
-          </w:p>
-        </w:tc>
-        <w:tc>
-          <w:tcPr>
-            <w:tcW w:type="dxa" w:w="1949"/>
-          </w:tcPr>
-          <w:p>
-            <w:r/>
-          </w:p>
-        </w:tc>
-        <w:tc>
-          <w:tcPr>
-            <w:tcW w:type="dxa" w:w="1949"/>
-          </w:tcPr>
-          <w:p>
-            <w:r>
-              <w:t>Ticketing / support process</w:t>
-            </w:r>
-          </w:p>
-        </w:tc>
-      </w:tr>
-      <w:tr>
-        <w:tc>
-          <w:tcPr>
-            <w:tcW w:type="dxa" w:w="1949"/>
-          </w:tcPr>
-          <w:p>
-            <w:r>
-              <w:t>11</w:t>
-            </w:r>
-          </w:p>
-        </w:tc>
-        <w:tc>
-          <w:tcPr>
-            <w:tcW w:type="dxa" w:w="1949"/>
-          </w:tcPr>
-          <w:p>
-            <w:r>
-              <w:t>Feedback</w:t>
-            </w:r>
-          </w:p>
-        </w:tc>
-        <w:tc>
-          <w:tcPr>
-            <w:tcW w:type="dxa" w:w="1949"/>
-          </w:tcPr>
-          <w:p>
-            <w:r>
-              <w:t>How do you obtain feedback from customers on the quality of your services?</w:t>
-            </w:r>
-          </w:p>
-        </w:tc>
-        <w:tc>
-          <w:tcPr>
-            <w:tcW w:type="dxa" w:w="1949"/>
-          </w:tcPr>
-          <w:p>
-            <w:r/>
-          </w:p>
-        </w:tc>
-        <w:tc>
-          <w:tcPr>
-            <w:tcW w:type="dxa" w:w="1949"/>
-          </w:tcPr>
-          <w:p>
-            <w:r>
-              <w:t>Survey results, QBR notes</w:t>
-            </w:r>
-          </w:p>
-        </w:tc>
-      </w:tr>
-      <w:tr>
-        <w:tc>
-          <w:tcPr>
-            <w:tcW w:type="dxa" w:w="1949"/>
-          </w:tcPr>
-          <w:p>
-            <w:r>
-              <w:t>12</w:t>
-            </w:r>
-          </w:p>
-        </w:tc>
-        <w:tc>
-          <w:tcPr>
-            <w:tcW w:type="dxa" w:w="1949"/>
-          </w:tcPr>
-          <w:p>
-            <w:r>
-              <w:t>Risk</w:t>
-            </w:r>
-          </w:p>
-        </w:tc>
-        <w:tc>
-          <w:tcPr>
-            <w:tcW w:type="dxa" w:w="1949"/>
-          </w:tcPr>
-          <w:p>
-            <w:r>
-              <w:t>How does management identify and assess risks, including fraud risk?</w:t>
-            </w:r>
-          </w:p>
-        </w:tc>
-        <w:tc>
-          <w:tcPr>
-            <w:tcW w:type="dxa" w:w="1949"/>
-          </w:tcPr>
-          <w:p>
-            <w:r/>
-          </w:p>
-        </w:tc>
-        <w:tc>
-          <w:tcPr>
-            <w:tcW w:type="dxa" w:w="1949"/>
-          </w:tcPr>
-          <w:p>
-            <w:r>
-              <w:t>Risk assessment, risk register</w:t>
-            </w:r>
-          </w:p>
-        </w:tc>
-      </w:tr>
-      <w:tr>
-        <w:tc>
-          <w:tcPr>
-            <w:tcW w:type="dxa" w:w="1949"/>
-          </w:tcPr>
-          <w:p>
-            <w:r>
-              <w:t>13</w:t>
-            </w:r>
-          </w:p>
-        </w:tc>
-        <w:tc>
-          <w:tcPr>
-            <w:tcW w:type="dxa" w:w="1949"/>
-          </w:tcPr>
-          <w:p>
-            <w:r>
-              <w:t>Events</w:t>
-            </w:r>
-          </w:p>
-        </w:tc>
-        <w:tc>
-          <w:tcPr>
-            <w:tcW w:type="dxa" w:w="1949"/>
-          </w:tcPr>
-          <w:p>
-            <w:r>
-              <w:t>Have there been any major problems during the audit period (outages, breaches, lawsuits, regulatory actions)? If so, describe them.</w:t>
-            </w:r>
-          </w:p>
-        </w:tc>
-        <w:tc>
-          <w:tcPr>
-            <w:tcW w:type="dxa" w:w="1949"/>
-          </w:tcPr>
-          <w:p>
-            <w:r/>
-          </w:p>
-        </w:tc>
-        <w:tc>
-          <w:tcPr>
-            <w:tcW w:type="dxa" w:w="1949"/>
-          </w:tcPr>
-          <w:p>
-            <w:r>
-              <w:t>Incident register</w:t>
+              <w:t>No</w:t>
             </w:r>
           </w:p>
         </w:tc>
       </w:tr>
     </w:tbl>
-    <w:p/>
-    <w:p>
-      <w:pPr>
-        <w:pStyle w:val="Heading2"/>
-      </w:pPr>
-      <w:r>
-        <w:t>Sign-off</w:t>
-      </w:r>
-    </w:p>
-    <w:tbl>
-      <w:tblPr>
-        <w:tblStyle w:val="TableGrid"/>
-        <w:tblW w:type="auto" w:w="0"/>
-        <w:tblLook w:firstColumn="1" w:firstRow="1" w:lastColumn="0" w:lastRow="0" w:noHBand="0" w:noVBand="1" w:val="04A0"/>
-      </w:tblPr>
-      <w:tblGrid>
-        <w:gridCol w:w="1949"/>
-        <w:gridCol w:w="1949"/>
-        <w:gridCol w:w="1949"/>
-        <w:gridCol w:w="1949"/>
-        <w:gridCol w:w="1949"/>
-      </w:tblGrid>
-      <w:tr>
-        <w:tc>
-          <w:tcPr>
-            <w:tcW w:type="dxa" w:w="1949"/>
-            <w:shd w:val="clear" w:color="auto" w:fill="5B21B6"/>
-          </w:tcPr>
-          <w:p>
-            <w:r>
-              <w:rPr>
-                <w:b/>
-                <w:color w:val="FFFFFF"/>
-                <w:sz w:val="19"/>
-              </w:rPr>
-              <w:t>Role</w:t>
-            </w:r>
-          </w:p>
-        </w:tc>
-        <w:tc>
-          <w:tcPr>
-            <w:tcW w:type="dxa" w:w="1949"/>
-            <w:shd w:val="clear" w:color="auto" w:fill="5B21B6"/>
-          </w:tcPr>
-          <w:p>
-            <w:r>
-              <w:rPr>
-                <w:b/>
-                <w:color w:val="FFFFFF"/>
-                <w:sz w:val="19"/>
-              </w:rPr>
-              <w:t>Name</w:t>
-            </w:r>
-          </w:p>
-        </w:tc>
-        <w:tc>
-          <w:tcPr>
-            <w:tcW w:type="dxa" w:w="1949"/>
-            <w:shd w:val="clear" w:color="auto" w:fill="5B21B6"/>
-          </w:tcPr>
-          <w:p>
-            <w:r>
-              <w:rPr>
-                <w:b/>
-                <w:color w:val="FFFFFF"/>
-                <w:sz w:val="19"/>
-              </w:rPr>
-              <w:t>Title</w:t>
-            </w:r>
-          </w:p>
-        </w:tc>
-        <w:tc>
-          <w:tcPr>
-            <w:tcW w:type="dxa" w:w="1949"/>
-            <w:shd w:val="clear" w:color="auto" w:fill="5B21B6"/>
-          </w:tcPr>
-          <w:p>
-            <w:r>
-              <w:rPr>
-                <w:b/>
-                <w:color w:val="FFFFFF"/>
-                <w:sz w:val="19"/>
-              </w:rPr>
-              <w:t>Signature</w:t>
-            </w:r>
-          </w:p>
-        </w:tc>
-        <w:tc>
-          <w:tcPr>
-            <w:tcW w:type="dxa" w:w="1949"/>
-            <w:shd w:val="clear" w:color="auto" w:fill="5B21B6"/>
-          </w:tcPr>
-          <w:p>
-            <w:r>
-              <w:rPr>
-                <w:b/>
-                <w:color w:val="FFFFFF"/>
-                <w:sz w:val="19"/>
-              </w:rPr>
-              <w:t>Date</w:t>
-            </w:r>
-          </w:p>
-        </w:tc>
-      </w:tr>
-      <w:tr>
-        <w:tc>
-          <w:tcPr>
-            <w:tcW w:type="dxa" w:w="1949"/>
-          </w:tcPr>
-          <w:p>
-            <w:r>
-              <w:t>Completed by</w:t>
-            </w:r>
-          </w:p>
-        </w:tc>
-        <w:tc>
-          <w:tcPr>
-            <w:tcW w:type="dxa" w:w="1949"/>
-          </w:tcPr>
-          <w:p>
-            <w:r/>
-          </w:p>
-        </w:tc>
-        <w:tc>
-          <w:tcPr>
-            <w:tcW w:type="dxa" w:w="1949"/>
-          </w:tcPr>
-          <w:p>
-            <w:r/>
-          </w:p>
-        </w:tc>
-        <w:tc>
-          <w:tcPr>
-            <w:tcW w:type="dxa" w:w="1949"/>
-          </w:tcPr>
-          <w:p>
-            <w:r/>
-          </w:p>
-        </w:tc>
-        <w:tc>
-          <w:tcPr>
-            <w:tcW w:type="dxa" w:w="1949"/>
-          </w:tcPr>
-          <w:p>
-            <w:r/>
-          </w:p>
-        </w:tc>
-      </w:tr>
-      <w:tr>
-        <w:tc>
-          <w:tcPr>
-            <w:tcW w:type="dxa" w:w="1949"/>
-          </w:tcPr>
-          <w:p>
-            <w:r>
-              <w:t>Approved by</w:t>
-            </w:r>
-          </w:p>
-        </w:tc>
-        <w:tc>
-          <w:tcPr>
-            <w:tcW w:type="dxa" w:w="1949"/>
-          </w:tcPr>
-          <w:p>
-            <w:r/>
-          </w:p>
-        </w:tc>
-        <w:tc>
-          <w:tcPr>
-            <w:tcW w:type="dxa" w:w="1949"/>
-          </w:tcPr>
-          <w:p>
-            <w:r/>
-          </w:p>
-        </w:tc>
-        <w:tc>
-          <w:tcPr>
-            <w:tcW w:type="dxa" w:w="1949"/>
-          </w:tcPr>
-          <w:p>
-            <w:r/>
-          </w:p>
-        </w:tc>
-        <w:tc>
-          <w:tcPr>
-            <w:tcW w:type="dxa" w:w="1949"/>
-          </w:tcPr>
-          <w:p>
-            <w:r/>
-          </w:p>
-        </w:tc>
-      </w:tr>
-    </w:tbl>
-    <w:p/>
     <w:sectPr>
-      <w:footerReference w:type="default" r:id="rId9"/>
       <w:pgSz w:w="12240" w:h="15840"/>
-      <w:pgMar w:top="1134" w:right="1247" w:bottom="1134" w:left="1247" w:header="720" w:footer="720" w:gutter="0"/>
+      <w:pgMar w:top="1440" w:right="1800" w:bottom="1440" w:left="1800" w:header="720" w:footer="720" w:gutter="0"/>
       <w:cols w:space="720"/>
       <w:docGrid w:linePitch="360"/>
     </w:sectPr>
   </w:body>
 </w:document>
-</file>
-
-<file path=word/footer1.xml><?xml version="1.0" encoding="utf-8"?>
-<w:ftr xmlns:m="http://schemas.openxmlformats.org/officeDocument/2006/math" xmlns:mc="http://schemas.openxmlformats.org/markup-compatibility/2006" xmlns:mo="http://schemas.microsoft.com/office/mac/office/2008/main" xmlns:mv="urn:schemas-microsoft-com:mac:vml" xmlns:o="urn:schemas-microsoft-com:office:office" xmlns:r="http://schemas.openxmlformats.org/officeDocument/2006/relationships" xmlns:v="urn:schemas-microsoft-com:vml" xmlns:w10="urn:schemas-microsoft-com:office:word" xmlns:w14="http://schemas.microsoft.com/office/word/2010/wordml" xmlns:w="http://schemas.openxmlformats.org/wordprocessingml/2006/main" xmlns:wne="http://schemas.microsoft.com/office/word/2006/wordml" xmlns:wp14="http://schemas.microsoft.com/office/word/2010/wordprocessingDrawing" xmlns:wp="http://schemas.openxmlformats.org/drawingml/2006/wordprocessingDrawing" xmlns:wpc="http://schemas.microsoft.com/office/word/2010/wordprocessingCanvas" xmlns:wpg="http://schemas.microsoft.com/office/word/2010/wordprocessingGroup" xmlns:wpi="http://schemas.microsoft.com/office/word/2010/wordprocessingInk" xmlns:wps="http://schemas.microsoft.com/office/word/2010/wordprocessingShape" mc:Ignorable="w14 wp14">
-  <w:p>
-    <w:pPr>
-      <w:pStyle w:val="Footer"/>
-    </w:pPr>
-    <w:r>
-      <w:rPr>
-        <w:sz w:val="16"/>
-      </w:rPr>
-      <w:t>Template provided by OneLens by Ruchi. Replace all [bracketed] fields before use.</w:t>
-    </w:r>
-  </w:p>
-</w:ftr>
 </file>
 
 <file path=word/numbering.xml><?xml version="1.0" encoding="utf-8"?>
@@ -1559,10 +620,6 @@
     <w:name w:val="Normal"/>
     <w:qFormat/>
     <w:rsid w:val="00FC693F"/>
-    <w:rPr>
-      <w:rFonts w:ascii="Calibri" w:hAnsi="Calibri"/>
-      <w:sz w:val="21"/>
-    </w:rPr>
   </w:style>
   <w:style w:type="paragraph" w:styleId="Header">
     <w:name w:val="header"/>
@@ -1623,11 +680,11 @@
       <w:outlineLvl w:val="0"/>
     </w:pPr>
     <w:rPr>
-      <w:rFonts w:asciiTheme="majorHAnsi" w:eastAsiaTheme="majorEastAsia" w:hAnsiTheme="majorHAnsi" w:cstheme="majorBidi" w:ascii="Calibri" w:hAnsi="Calibri"/>
+      <w:rFonts w:asciiTheme="majorHAnsi" w:eastAsiaTheme="majorEastAsia" w:hAnsiTheme="majorHAnsi" w:cstheme="majorBidi"/>
       <w:b/>
       <w:bCs/>
-      <w:color w:val="5B21B6"/>
-      <w:sz w:val="30"/>
+      <w:color w:val="365F91" w:themeColor="accent1" w:themeShade="BF"/>
+      <w:sz w:val="28"/>
       <w:szCs w:val="28"/>
     </w:rPr>
   </w:style>
@@ -1647,11 +704,11 @@
       <w:outlineLvl w:val="1"/>
     </w:pPr>
     <w:rPr>
-      <w:rFonts w:asciiTheme="majorHAnsi" w:eastAsiaTheme="majorEastAsia" w:hAnsiTheme="majorHAnsi" w:cstheme="majorBidi" w:ascii="Calibri" w:hAnsi="Calibri"/>
+      <w:rFonts w:asciiTheme="majorHAnsi" w:eastAsiaTheme="majorEastAsia" w:hAnsiTheme="majorHAnsi" w:cstheme="majorBidi"/>
       <w:b/>
       <w:bCs/>
-      <w:color w:val="5B21B6"/>
-      <w:sz w:val="25"/>
+      <w:color w:val="4F81BD" w:themeColor="accent1"/>
+      <w:sz w:val="26"/>
       <w:szCs w:val="26"/>
     </w:rPr>
   </w:style>
@@ -1671,11 +728,10 @@
       <w:outlineLvl w:val="2"/>
     </w:pPr>
     <w:rPr>
-      <w:rFonts w:asciiTheme="majorHAnsi" w:eastAsiaTheme="majorEastAsia" w:hAnsiTheme="majorHAnsi" w:cstheme="majorBidi" w:ascii="Calibri" w:hAnsi="Calibri"/>
+      <w:rFonts w:asciiTheme="majorHAnsi" w:eastAsiaTheme="majorEastAsia" w:hAnsiTheme="majorHAnsi" w:cstheme="majorBidi"/>
       <w:b/>
       <w:bCs/>
-      <w:color w:val="5B21B6"/>
-      <w:sz w:val="22"/>
+      <w:color w:val="4F81BD" w:themeColor="accent1"/>
     </w:rPr>
   </w:style>
   <w:style w:type="paragraph" w:styleId="Heading4">

</xml_diff>